<commit_message>
Update design docs and designer components: add FieldSelectDialog, update CanvasNode/PropertyPanel/PageSelectDialog/RendererNode
</commit_message>
<xml_diff>
--- a/docs/低代码平台前端设计文档.docx
+++ b/docs/低代码平台前端设计文档.docx
@@ -20735,6 +20735,282 @@
           </w:p>
         </w:tc>
       </w:tr>
+      <w:tr>
+        <w:tc>
+          <w:p>
+            <w:pPr>
+              <w:spacing w:before="40" w:after="40"/>
+            </w:pPr>
+            <w:r>
+              <w:rPr>
+                <w:rFonts w:ascii="Consolas" w:cs="Consolas" w:eastAsia="Consolas" w:hAnsi="Consolas"/>
+                <w:shd w:fill="ECECEC" w:color="auto" w:val="solid"/>
+              </w:rPr>
+              <w:t xml:space="preserve">components/renderer/BatchActionDialog.vue</w:t>
+            </w:r>
+          </w:p>
+        </w:tc>
+        <w:tc>
+          <w:p>
+            <w:pPr>
+              <w:spacing w:before="40" w:after="40"/>
+            </w:pPr>
+            <w:r>
+              <w:t xml:space="preserve">批量操作确认弹窗</w:t>
+            </w:r>
+          </w:p>
+        </w:tc>
+        <w:tc>
+          <w:p>
+            <w:pPr>
+              <w:spacing w:before="40" w:after="40"/>
+            </w:pPr>
+            <w:r>
+              <w:t xml:space="preserve">现有弹窗</w:t>
+            </w:r>
+          </w:p>
+        </w:tc>
+        <w:tc>
+          <w:p>
+            <w:pPr>
+              <w:spacing w:before="40" w:after="40"/>
+            </w:pPr>
+            <w:r>
+              <w:t xml:space="preserve">批量操作</w:t>
+            </w:r>
+          </w:p>
+        </w:tc>
+      </w:tr>
+      <w:tr>
+        <w:tc>
+          <w:p>
+            <w:pPr>
+              <w:spacing w:before="40" w:after="40"/>
+            </w:pPr>
+            <w:r>
+              <w:rPr>
+                <w:rFonts w:ascii="Consolas" w:cs="Consolas" w:eastAsia="Consolas" w:hAnsi="Consolas"/>
+                <w:shd w:fill="ECECEC" w:color="auto" w:val="solid"/>
+              </w:rPr>
+              <w:t xml:space="preserve">components/renderer/AttachmentPanel.vue</w:t>
+            </w:r>
+          </w:p>
+        </w:tc>
+        <w:tc>
+          <w:p>
+            <w:pPr>
+              <w:spacing w:before="40" w:after="40"/>
+            </w:pPr>
+            <w:r>
+              <w:t xml:space="preserve">附件上传/下载/删除区域</w:t>
+            </w:r>
+          </w:p>
+        </w:tc>
+        <w:tc>
+          <w:p>
+            <w:pPr>
+              <w:spacing w:before="40" w:after="40"/>
+            </w:pPr>
+            <w:r>
+              <w:t xml:space="preserve">运行时组件</w:t>
+            </w:r>
+          </w:p>
+        </w:tc>
+        <w:tc>
+          <w:p>
+            <w:pPr>
+              <w:spacing w:before="40" w:after="40"/>
+            </w:pPr>
+            <w:r>
+              <w:t xml:space="preserve">附件管理</w:t>
+            </w:r>
+          </w:p>
+        </w:tc>
+      </w:tr>
+      <w:tr>
+        <w:tc>
+          <w:p>
+            <w:pPr>
+              <w:spacing w:before="40" w:after="40"/>
+            </w:pPr>
+            <w:r>
+              <w:rPr>
+                <w:rFonts w:ascii="Consolas" w:cs="Consolas" w:eastAsia="Consolas" w:hAnsi="Consolas"/>
+                <w:shd w:fill="ECECEC" w:color="auto" w:val="solid"/>
+              </w:rPr>
+              <w:t xml:space="preserve">components/designer/AttachmentConfigDialog.vue</w:t>
+            </w:r>
+          </w:p>
+        </w:tc>
+        <w:tc>
+          <w:p>
+            <w:pPr>
+              <w:spacing w:before="40" w:after="40"/>
+            </w:pPr>
+            <w:r>
+              <w:t xml:space="preserve">附件配置弹窗</w:t>
+            </w:r>
+          </w:p>
+        </w:tc>
+        <w:tc>
+          <w:p>
+            <w:pPr>
+              <w:spacing w:before="40" w:after="40"/>
+            </w:pPr>
+            <w:r>
+              <w:t xml:space="preserve">现有弹窗</w:t>
+            </w:r>
+          </w:p>
+        </w:tc>
+        <w:tc>
+          <w:p>
+            <w:pPr>
+              <w:spacing w:before="40" w:after="40"/>
+            </w:pPr>
+            <w:r>
+              <w:t xml:space="preserve">附件管理</w:t>
+            </w:r>
+          </w:p>
+        </w:tc>
+      </w:tr>
+      <w:tr>
+        <w:tc>
+          <w:p>
+            <w:pPr>
+              <w:spacing w:before="40" w:after="40"/>
+            </w:pPr>
+            <w:r>
+              <w:rPr>
+                <w:rFonts w:ascii="Consolas" w:cs="Consolas" w:eastAsia="Consolas" w:hAnsi="Consolas"/>
+                <w:shd w:fill="ECECEC" w:color="auto" w:val="solid"/>
+              </w:rPr>
+              <w:t xml:space="preserve">views/DataDictView.vue</w:t>
+            </w:r>
+          </w:p>
+        </w:tc>
+        <w:tc>
+          <w:p>
+            <w:pPr>
+              <w:spacing w:before="40" w:after="40"/>
+            </w:pPr>
+            <w:r>
+              <w:t xml:space="preserve">数据字典管理</w:t>
+            </w:r>
+          </w:p>
+        </w:tc>
+        <w:tc>
+          <w:p>
+            <w:pPr>
+              <w:spacing w:before="40" w:after="40"/>
+            </w:pPr>
+            <w:r>
+              <w:t xml:space="preserve">PageManageView</w:t>
+            </w:r>
+          </w:p>
+        </w:tc>
+        <w:tc>
+          <w:p>
+            <w:pPr>
+              <w:spacing w:before="40" w:after="40"/>
+            </w:pPr>
+            <w:r>
+              <w:t xml:space="preserve">数据字典</w:t>
+            </w:r>
+          </w:p>
+        </w:tc>
+      </w:tr>
+      <w:tr>
+        <w:tc>
+          <w:p>
+            <w:pPr>
+              <w:spacing w:before="40" w:after="40"/>
+            </w:pPr>
+            <w:r>
+              <w:rPr>
+                <w:rFonts w:ascii="Consolas" w:cs="Consolas" w:eastAsia="Consolas" w:hAnsi="Consolas"/>
+                <w:shd w:fill="ECECEC" w:color="auto" w:val="solid"/>
+              </w:rPr>
+              <w:t xml:space="preserve">types/dict.ts</w:t>
+            </w:r>
+          </w:p>
+        </w:tc>
+        <w:tc>
+          <w:p>
+            <w:pPr>
+              <w:spacing w:before="40" w:after="40"/>
+            </w:pPr>
+            <w:r>
+              <w:t xml:space="preserve">字典类型定义</w:t>
+            </w:r>
+          </w:p>
+        </w:tc>
+        <w:tc>
+          <w:p>
+            <w:pPr>
+              <w:spacing w:before="40" w:after="40"/>
+            </w:pPr>
+            <w:r>
+              <w:t xml:space="preserve">—</w:t>
+            </w:r>
+          </w:p>
+        </w:tc>
+        <w:tc>
+          <w:p>
+            <w:pPr>
+              <w:spacing w:before="40" w:after="40"/>
+            </w:pPr>
+            <w:r>
+              <w:t xml:space="preserve">数据字典</w:t>
+            </w:r>
+          </w:p>
+        </w:tc>
+      </w:tr>
+      <w:tr>
+        <w:tc>
+          <w:p>
+            <w:pPr>
+              <w:spacing w:before="40" w:after="40"/>
+            </w:pPr>
+            <w:r>
+              <w:rPr>
+                <w:rFonts w:ascii="Consolas" w:cs="Consolas" w:eastAsia="Consolas" w:hAnsi="Consolas"/>
+                <w:shd w:fill="ECECEC" w:color="auto" w:val="solid"/>
+              </w:rPr>
+              <w:t xml:space="preserve">components/designer/NumberRuleDialog.vue</w:t>
+            </w:r>
+          </w:p>
+        </w:tc>
+        <w:tc>
+          <w:p>
+            <w:pPr>
+              <w:spacing w:before="40" w:after="40"/>
+            </w:pPr>
+            <w:r>
+              <w:t xml:space="preserve">编号规则可视化配置</w:t>
+            </w:r>
+          </w:p>
+        </w:tc>
+        <w:tc>
+          <w:p>
+            <w:pPr>
+              <w:spacing w:before="40" w:after="40"/>
+            </w:pPr>
+            <w:r>
+              <w:t xml:space="preserve">现有弹窗</w:t>
+            </w:r>
+          </w:p>
+        </w:tc>
+        <w:tc>
+          <w:p>
+            <w:pPr>
+              <w:spacing w:before="40" w:after="40"/>
+            </w:pPr>
+            <w:r>
+              <w:t xml:space="preserve">编号规则</w:t>
+            </w:r>
+          </w:p>
+        </w:tc>
+      </w:tr>
     </w:tbl>
     <w:p>
       <w:r/>
@@ -20751,7 +21027,7 @@
           <w:b/>
           <w:bCs/>
         </w:rPr>
-        <w:t xml:space="preserve">新增 36 个文件，扩展 21 个现有文件。所有新增视图/弹窗复用现有模式，不引入新框架（审批流画布图形化时按需引入 LogicFlow 轻量库）。</w:t>
+        <w:t xml:space="preserve">新增 42 个文件，扩展 21 个现有文件。所有新增视图/弹窗复用现有模式，不引入新框架（审批流画布图形化时按需引入 LogicFlow 轻量库）。</w:t>
       </w:r>
     </w:p>
     <w:p>
@@ -21048,7 +21324,1847 @@
           <w:bCs/>
           <w:rFonts w:ascii="微软雅黑" w:cs="微软雅黑" w:eastAsia="微软雅黑" w:hAnsi="微软雅黑"/>
         </w:rPr>
-        <w:t xml:space="preserve">28. 落地顺序（前端）</w:t>
+        <w:t xml:space="preserve">28. 用友 BIP 借鉴：6 个功能增强前端改动（后端第 29 章）</w:t>
+      </w:r>
+    </w:p>
+    <w:p>
+      <w:r/>
+    </w:p>
+    <w:p>
+      <w:pPr>
+        <w:pStyle w:val="Heading3"/>
+      </w:pPr>
+      <w:r>
+        <w:rPr>
+          <w:b/>
+          <w:bCs/>
+          <w:rFonts w:ascii="微软雅黑" w:cs="微软雅黑" w:eastAsia="微软雅黑" w:hAnsi="微软雅黑"/>
+        </w:rPr>
+        <w:t xml:space="preserve">28.1 计算表达式（P1）</w:t>
+      </w:r>
+    </w:p>
+    <w:p>
+      <w:r/>
+    </w:p>
+    <w:tbl>
+      <w:tblPr>
+        <w:tblW w:type="pct" w:w="100%"/>
+        <w:tblBorders>
+          <w:top w:val="single" w:color="auto" w:sz="4"/>
+          <w:left w:val="single" w:color="auto" w:sz="4"/>
+          <w:bottom w:val="single" w:color="auto" w:sz="4"/>
+          <w:right w:val="single" w:color="auto" w:sz="4"/>
+          <w:insideH w:val="single" w:color="auto" w:sz="4"/>
+          <w:insideV w:val="single" w:color="auto" w:sz="4"/>
+        </w:tblBorders>
+      </w:tblPr>
+      <w:tblGrid>
+        <w:gridCol w:w="100"/>
+        <w:gridCol w:w="100"/>
+        <w:gridCol w:w="100"/>
+      </w:tblGrid>
+      <w:tr>
+        <w:trPr>
+          <w:tblHeader/>
+        </w:trPr>
+        <w:tc>
+          <w:tcPr>
+            <w:shd w:fill="D9E2F3" w:color="auto" w:val="solid"/>
+          </w:tcPr>
+          <w:p>
+            <w:pPr>
+              <w:spacing w:before="40" w:after="40"/>
+            </w:pPr>
+            <w:r>
+              <w:t xml:space="preserve">文件</w:t>
+            </w:r>
+          </w:p>
+        </w:tc>
+        <w:tc>
+          <w:tcPr>
+            <w:shd w:fill="D9E2F3" w:color="auto" w:val="solid"/>
+          </w:tcPr>
+          <w:p>
+            <w:pPr>
+              <w:spacing w:before="40" w:after="40"/>
+            </w:pPr>
+            <w:r>
+              <w:t xml:space="preserve">改动</w:t>
+            </w:r>
+          </w:p>
+        </w:tc>
+        <w:tc>
+          <w:tcPr>
+            <w:shd w:fill="D9E2F3" w:color="auto" w:val="solid"/>
+          </w:tcPr>
+          <w:p>
+            <w:pPr>
+              <w:spacing w:before="40" w:after="40"/>
+            </w:pPr>
+            <w:r>
+              <w:t xml:space="preserve">说明</w:t>
+            </w:r>
+          </w:p>
+        </w:tc>
+      </w:tr>
+      <w:tr>
+        <w:tc>
+          <w:p>
+            <w:pPr>
+              <w:spacing w:before="40" w:after="40"/>
+            </w:pPr>
+            <w:r>
+              <w:rPr>
+                <w:rFonts w:ascii="Consolas" w:cs="Consolas" w:eastAsia="Consolas" w:hAnsi="Consolas"/>
+                <w:shd w:fill="ECECEC" w:color="auto" w:val="solid"/>
+              </w:rPr>
+              <w:t xml:space="preserve">components/renderer/RendererNode.vue</w:t>
+            </w:r>
+          </w:p>
+        </w:tc>
+        <w:tc>
+          <w:p>
+            <w:pPr>
+              <w:spacing w:before="40" w:after="40"/>
+            </w:pPr>
+            <w:r>
+              <w:t xml:space="preserve">watch 依赖字段变化时触发计算，自动更新目标字段值</w:t>
+            </w:r>
+          </w:p>
+        </w:tc>
+        <w:tc>
+          <w:p>
+            <w:pPr>
+              <w:spacing w:before="40" w:after="40"/>
+            </w:pPr>
+            <w:r>
+              <w:t xml:space="preserve">复用现有 watch 机制</w:t>
+            </w:r>
+          </w:p>
+        </w:tc>
+      </w:tr>
+      <w:tr>
+        <w:tc>
+          <w:p>
+            <w:pPr>
+              <w:spacing w:before="40" w:after="40"/>
+            </w:pPr>
+            <w:r>
+              <w:rPr>
+                <w:rFonts w:ascii="Consolas" w:cs="Consolas" w:eastAsia="Consolas" w:hAnsi="Consolas"/>
+                <w:shd w:fill="ECECEC" w:color="auto" w:val="solid"/>
+              </w:rPr>
+              <w:t xml:space="preserve">components/designer/PropertyPanel.vue</w:t>
+            </w:r>
+          </w:p>
+        </w:tc>
+        <w:tc>
+          <w:p>
+            <w:pPr>
+              <w:spacing w:before="40" w:after="40"/>
+            </w:pPr>
+            <w:r>
+              <w:t xml:space="preserve">basic 标签页加"计算表达式"配置入口</w:t>
+            </w:r>
+          </w:p>
+        </w:tc>
+        <w:tc>
+          <w:p>
+            <w:pPr>
+              <w:spacing w:before="40" w:after="40"/>
+            </w:pPr>
+            <w:r>
+              <w:t xml:space="preserve">扩展现有属性编辑</w:t>
+            </w:r>
+          </w:p>
+        </w:tc>
+      </w:tr>
+      <w:tr>
+        <w:tc>
+          <w:p>
+            <w:pPr>
+              <w:spacing w:before="40" w:after="40"/>
+            </w:pPr>
+            <w:r>
+              <w:rPr>
+                <w:rFonts w:ascii="Consolas" w:cs="Consolas" w:eastAsia="Consolas" w:hAnsi="Consolas"/>
+                <w:shd w:fill="ECECEC" w:color="auto" w:val="solid"/>
+              </w:rPr>
+              <w:t xml:space="preserve">types/schema.ts</w:t>
+            </w:r>
+          </w:p>
+        </w:tc>
+        <w:tc>
+          <w:p>
+            <w:pPr>
+              <w:spacing w:before="40" w:after="40"/>
+            </w:pPr>
+            <w:r>
+              <w:t xml:space="preserve">ComponentSchema 加 </w:t>
+            </w:r>
+            <w:r>
+              <w:rPr>
+                <w:rFonts w:ascii="Consolas" w:cs="Consolas" w:eastAsia="Consolas" w:hAnsi="Consolas"/>
+                <w:shd w:fill="ECECEC" w:color="auto" w:val="solid"/>
+              </w:rPr>
+              <w:t xml:space="preserve">computeExpr</w:t>
+            </w:r>
+            <w:r>
+              <w:t xml:space="preserve">/</w:t>
+            </w:r>
+            <w:r>
+              <w:rPr>
+                <w:rFonts w:ascii="Consolas" w:cs="Consolas" w:eastAsia="Consolas" w:hAnsi="Consolas"/>
+                <w:shd w:fill="ECECEC" w:color="auto" w:val="solid"/>
+              </w:rPr>
+              <w:t xml:space="preserve">computeTriggerFields</w:t>
+            </w:r>
+          </w:p>
+        </w:tc>
+        <w:tc>
+          <w:p>
+            <w:pPr>
+              <w:spacing w:before="40" w:after="40"/>
+            </w:pPr>
+            <w:r>
+              <w:t xml:space="preserve">扩展现有类型</w:t>
+            </w:r>
+          </w:p>
+        </w:tc>
+      </w:tr>
+    </w:tbl>
+    <w:p>
+      <w:r/>
+    </w:p>
+    <w:p>
+      <w:r/>
+    </w:p>
+    <w:p>
+      <w:pPr>
+        <w:shd w:fill="F5F5F5" w:color="auto" w:val="solid"/>
+        <w:spacing w:before="0" w:after="0"/>
+        <w:ind w:left="200"/>
+      </w:pPr>
+      <w:r>
+        <w:rPr>
+          <w:sz w:val="18"/>
+          <w:szCs w:val="18"/>
+          <w:rFonts w:ascii="Consolas" w:cs="Consolas" w:eastAsia="Consolas" w:hAnsi="Consolas"/>
+        </w:rPr>
+        <w:t xml:space="preserve">// RendererNode.vue 内计算表达式触发</w:t>
+      </w:r>
+    </w:p>
+    <w:p>
+      <w:pPr>
+        <w:shd w:fill="F5F5F5" w:color="auto" w:val="solid"/>
+        <w:spacing w:before="0" w:after="0"/>
+        <w:ind w:left="200"/>
+      </w:pPr>
+      <w:r>
+        <w:rPr>
+          <w:sz w:val="18"/>
+          <w:szCs w:val="18"/>
+          <w:rFonts w:ascii="Consolas" w:cs="Consolas" w:eastAsia="Consolas" w:hAnsi="Consolas"/>
+        </w:rPr>
+        <w:t xml:space="preserve">watch(() =&gt; getNodeValue(node.computeTriggerFields), () =&gt; {</w:t>
+      </w:r>
+    </w:p>
+    <w:p>
+      <w:pPr>
+        <w:shd w:fill="F5F5F5" w:color="auto" w:val="solid"/>
+        <w:spacing w:before="0" w:after="0"/>
+        <w:ind w:left="200"/>
+      </w:pPr>
+      <w:r>
+        <w:rPr>
+          <w:sz w:val="18"/>
+          <w:szCs w:val="18"/>
+          <w:rFonts w:ascii="Consolas" w:cs="Consolas" w:eastAsia="Consolas" w:hAnsi="Consolas"/>
+        </w:rPr>
+        <w:t xml:space="preserve">  if (node.computeExpr) {</w:t>
+      </w:r>
+    </w:p>
+    <w:p>
+      <w:pPr>
+        <w:shd w:fill="F5F5F5" w:color="auto" w:val="solid"/>
+        <w:spacing w:before="0" w:after="0"/>
+        <w:ind w:left="200"/>
+      </w:pPr>
+      <w:r>
+        <w:rPr>
+          <w:sz w:val="18"/>
+          <w:szCs w:val="18"/>
+          <w:rFonts w:ascii="Consolas" w:cs="Consolas" w:eastAsia="Consolas" w:hAnsi="Consolas"/>
+        </w:rPr>
+        <w:t xml:space="preserve">    const result = evaluateExpr(node.computeExpr, formData)</w:t>
+      </w:r>
+    </w:p>
+    <w:p>
+      <w:pPr>
+        <w:shd w:fill="F5F5F5" w:color="auto" w:val="solid"/>
+        <w:spacing w:before="0" w:after="0"/>
+        <w:ind w:left="200"/>
+      </w:pPr>
+      <w:r>
+        <w:rPr>
+          <w:sz w:val="18"/>
+          <w:szCs w:val="18"/>
+          <w:rFonts w:ascii="Consolas" w:cs="Consolas" w:eastAsia="Consolas" w:hAnsi="Consolas"/>
+        </w:rPr>
+        <w:t xml:space="preserve">    setNodeValue(node.fieldName, result)</w:t>
+      </w:r>
+    </w:p>
+    <w:p>
+      <w:pPr>
+        <w:shd w:fill="F5F5F5" w:color="auto" w:val="solid"/>
+        <w:spacing w:before="0" w:after="0"/>
+        <w:ind w:left="200"/>
+      </w:pPr>
+      <w:r>
+        <w:rPr>
+          <w:sz w:val="18"/>
+          <w:szCs w:val="18"/>
+          <w:rFonts w:ascii="Consolas" w:cs="Consolas" w:eastAsia="Consolas" w:hAnsi="Consolas"/>
+        </w:rPr>
+        <w:t xml:space="preserve">  }</w:t>
+      </w:r>
+    </w:p>
+    <w:p>
+      <w:pPr>
+        <w:shd w:fill="F5F5F5" w:color="auto" w:val="solid"/>
+        <w:spacing w:before="0" w:after="0"/>
+        <w:ind w:left="200"/>
+      </w:pPr>
+      <w:r>
+        <w:rPr>
+          <w:sz w:val="18"/>
+          <w:szCs w:val="18"/>
+          <w:rFonts w:ascii="Consolas" w:cs="Consolas" w:eastAsia="Consolas" w:hAnsi="Consolas"/>
+        </w:rPr>
+        <w:t xml:space="preserve">}, { deep: true })</w:t>
+      </w:r>
+    </w:p>
+    <w:p>
+      <w:r/>
+    </w:p>
+    <w:p>
+      <w:r/>
+    </w:p>
+    <w:p>
+      <w:pPr>
+        <w:pStyle w:val="Heading3"/>
+      </w:pPr>
+      <w:r>
+        <w:rPr>
+          <w:b/>
+          <w:bCs/>
+          <w:rFonts w:ascii="微软雅黑" w:cs="微软雅黑" w:eastAsia="微软雅黑" w:hAnsi="微软雅黑"/>
+        </w:rPr>
+        <w:t xml:space="preserve">28.2 批量操作（P1）</w:t>
+      </w:r>
+    </w:p>
+    <w:p>
+      <w:r/>
+    </w:p>
+    <w:tbl>
+      <w:tblPr>
+        <w:tblW w:type="pct" w:w="100%"/>
+        <w:tblBorders>
+          <w:top w:val="single" w:color="auto" w:sz="4"/>
+          <w:left w:val="single" w:color="auto" w:sz="4"/>
+          <w:bottom w:val="single" w:color="auto" w:sz="4"/>
+          <w:right w:val="single" w:color="auto" w:sz="4"/>
+          <w:insideH w:val="single" w:color="auto" w:sz="4"/>
+          <w:insideV w:val="single" w:color="auto" w:sz="4"/>
+        </w:tblBorders>
+      </w:tblPr>
+      <w:tblGrid>
+        <w:gridCol w:w="100"/>
+        <w:gridCol w:w="100"/>
+        <w:gridCol w:w="100"/>
+      </w:tblGrid>
+      <w:tr>
+        <w:trPr>
+          <w:tblHeader/>
+        </w:trPr>
+        <w:tc>
+          <w:tcPr>
+            <w:shd w:fill="D9E2F3" w:color="auto" w:val="solid"/>
+          </w:tcPr>
+          <w:p>
+            <w:pPr>
+              <w:spacing w:before="40" w:after="40"/>
+            </w:pPr>
+            <w:r>
+              <w:t xml:space="preserve">文件</w:t>
+            </w:r>
+          </w:p>
+        </w:tc>
+        <w:tc>
+          <w:tcPr>
+            <w:shd w:fill="D9E2F3" w:color="auto" w:val="solid"/>
+          </w:tcPr>
+          <w:p>
+            <w:pPr>
+              <w:spacing w:before="40" w:after="40"/>
+            </w:pPr>
+            <w:r>
+              <w:t xml:space="preserve">改动</w:t>
+            </w:r>
+          </w:p>
+        </w:tc>
+        <w:tc>
+          <w:tcPr>
+            <w:shd w:fill="D9E2F3" w:color="auto" w:val="solid"/>
+          </w:tcPr>
+          <w:p>
+            <w:pPr>
+              <w:spacing w:before="40" w:after="40"/>
+            </w:pPr>
+            <w:r>
+              <w:t xml:space="preserve">说明</w:t>
+            </w:r>
+          </w:p>
+        </w:tc>
+      </w:tr>
+      <w:tr>
+        <w:tc>
+          <w:p>
+            <w:pPr>
+              <w:spacing w:before="40" w:after="40"/>
+            </w:pPr>
+            <w:r>
+              <w:rPr>
+                <w:rFonts w:ascii="Consolas" w:cs="Consolas" w:eastAsia="Consolas" w:hAnsi="Consolas"/>
+                <w:shd w:fill="ECECEC" w:color="auto" w:val="solid"/>
+              </w:rPr>
+              <w:t xml:space="preserve">components/renderer/RendererNode.vue</w:t>
+            </w:r>
+          </w:p>
+        </w:tc>
+        <w:tc>
+          <w:p>
+            <w:pPr>
+              <w:spacing w:before="40" w:after="40"/>
+            </w:pPr>
+            <w:r>
+              <w:t xml:space="preserve">表格页选中行后显示批量操作按钮（批量下达/审批/冻结/删除）</w:t>
+            </w:r>
+          </w:p>
+        </w:tc>
+        <w:tc>
+          <w:p>
+            <w:pPr>
+              <w:spacing w:before="40" w:after="40"/>
+            </w:pPr>
+            <w:r>
+              <w:t xml:space="preserve">扩展现有表格工具栏</w:t>
+            </w:r>
+          </w:p>
+        </w:tc>
+      </w:tr>
+      <w:tr>
+        <w:tc>
+          <w:p>
+            <w:pPr>
+              <w:spacing w:before="40" w:after="40"/>
+            </w:pPr>
+            <w:r>
+              <w:rPr>
+                <w:b/>
+                <w:bCs/>
+              </w:rPr>
+              <w:t xml:space="preserve">新建</w:t>
+            </w:r>
+            <w:r>
+              <w:t xml:space="preserve"> </w:t>
+            </w:r>
+            <w:r>
+              <w:rPr>
+                <w:rFonts w:ascii="Consolas" w:cs="Consolas" w:eastAsia="Consolas" w:hAnsi="Consolas"/>
+                <w:shd w:fill="ECECEC" w:color="auto" w:val="solid"/>
+              </w:rPr>
+              <w:t xml:space="preserve">components/renderer/BatchActionDialog.vue</w:t>
+            </w:r>
+          </w:p>
+        </w:tc>
+        <w:tc>
+          <w:p>
+            <w:pPr>
+              <w:spacing w:before="40" w:after="40"/>
+            </w:pPr>
+            <w:r>
+              <w:t xml:space="preserve">批量操作确认弹窗（显示选中数量+操作类型+确认）</w:t>
+            </w:r>
+          </w:p>
+        </w:tc>
+        <w:tc>
+          <w:p>
+            <w:pPr>
+              <w:spacing w:before="40" w:after="40"/>
+            </w:pPr>
+            <w:r>
+              <w:t xml:space="preserve">复用现有弹窗</w:t>
+            </w:r>
+          </w:p>
+        </w:tc>
+      </w:tr>
+    </w:tbl>
+    <w:p>
+      <w:r/>
+    </w:p>
+    <w:p>
+      <w:r/>
+    </w:p>
+    <w:p>
+      <w:pPr>
+        <w:shd w:fill="F5F5F5" w:color="auto" w:val="solid"/>
+        <w:spacing w:before="0" w:after="0"/>
+        <w:ind w:left="200"/>
+      </w:pPr>
+      <w:r>
+        <w:rPr>
+          <w:sz w:val="18"/>
+          <w:szCs w:val="18"/>
+          <w:rFonts w:ascii="Consolas" w:cs="Consolas" w:eastAsia="Consolas" w:hAnsi="Consolas"/>
+        </w:rPr>
+        <w:t xml:space="preserve">// 批量操作调用</w:t>
+      </w:r>
+    </w:p>
+    <w:p>
+      <w:pPr>
+        <w:shd w:fill="F5F5F5" w:color="auto" w:val="solid"/>
+        <w:spacing w:before="0" w:after="0"/>
+        <w:ind w:left="200"/>
+      </w:pPr>
+      <w:r>
+        <w:rPr>
+          <w:sz w:val="18"/>
+          <w:szCs w:val="18"/>
+          <w:rFonts w:ascii="Consolas" w:cs="Consolas" w:eastAsia="Consolas" w:hAnsi="Consolas"/>
+        </w:rPr>
+        <w:t xml:space="preserve">async function batchAction(action: string, ids: string[]) {</w:t>
+      </w:r>
+    </w:p>
+    <w:p>
+      <w:pPr>
+        <w:shd w:fill="F5F5F5" w:color="auto" w:val="solid"/>
+        <w:spacing w:before="0" w:after="0"/>
+        <w:ind w:left="200"/>
+      </w:pPr>
+      <w:r>
+        <w:rPr>
+          <w:sz w:val="18"/>
+          <w:szCs w:val="18"/>
+          <w:rFonts w:ascii="Consolas" w:cs="Consolas" w:eastAsia="Consolas" w:hAnsi="Consolas"/>
+        </w:rPr>
+        <w:t xml:space="preserve">  await gatewayCall(bizCode, `batch${action}`, { ids })</w:t>
+      </w:r>
+    </w:p>
+    <w:p>
+      <w:pPr>
+        <w:shd w:fill="F5F5F5" w:color="auto" w:val="solid"/>
+        <w:spacing w:before="0" w:after="0"/>
+        <w:ind w:left="200"/>
+      </w:pPr>
+      <w:r>
+        <w:rPr>
+          <w:sz w:val="18"/>
+          <w:szCs w:val="18"/>
+          <w:rFonts w:ascii="Consolas" w:cs="Consolas" w:eastAsia="Consolas" w:hAnsi="Consolas"/>
+        </w:rPr>
+        <w:t xml:space="preserve">}</w:t>
+      </w:r>
+    </w:p>
+    <w:p>
+      <w:r/>
+    </w:p>
+    <w:p>
+      <w:r/>
+    </w:p>
+    <w:p>
+      <w:pPr>
+        <w:pStyle w:val="Heading3"/>
+      </w:pPr>
+      <w:r>
+        <w:rPr>
+          <w:b/>
+          <w:bCs/>
+          <w:rFonts w:ascii="微软雅黑" w:cs="微软雅黑" w:eastAsia="微软雅黑" w:hAnsi="微软雅黑"/>
+        </w:rPr>
+        <w:t xml:space="preserve">28.3 数据冻结（P1）</w:t>
+      </w:r>
+    </w:p>
+    <w:p>
+      <w:r/>
+    </w:p>
+    <w:tbl>
+      <w:tblPr>
+        <w:tblW w:type="pct" w:w="100%"/>
+        <w:tblBorders>
+          <w:top w:val="single" w:color="auto" w:sz="4"/>
+          <w:left w:val="single" w:color="auto" w:sz="4"/>
+          <w:bottom w:val="single" w:color="auto" w:sz="4"/>
+          <w:right w:val="single" w:color="auto" w:sz="4"/>
+          <w:insideH w:val="single" w:color="auto" w:sz="4"/>
+          <w:insideV w:val="single" w:color="auto" w:sz="4"/>
+        </w:tblBorders>
+      </w:tblPr>
+      <w:tblGrid>
+        <w:gridCol w:w="100"/>
+        <w:gridCol w:w="100"/>
+        <w:gridCol w:w="100"/>
+      </w:tblGrid>
+      <w:tr>
+        <w:trPr>
+          <w:tblHeader/>
+        </w:trPr>
+        <w:tc>
+          <w:tcPr>
+            <w:shd w:fill="D9E2F3" w:color="auto" w:val="solid"/>
+          </w:tcPr>
+          <w:p>
+            <w:pPr>
+              <w:spacing w:before="40" w:after="40"/>
+            </w:pPr>
+            <w:r>
+              <w:t xml:space="preserve">文件</w:t>
+            </w:r>
+          </w:p>
+        </w:tc>
+        <w:tc>
+          <w:tcPr>
+            <w:shd w:fill="D9E2F3" w:color="auto" w:val="solid"/>
+          </w:tcPr>
+          <w:p>
+            <w:pPr>
+              <w:spacing w:before="40" w:after="40"/>
+            </w:pPr>
+            <w:r>
+              <w:t xml:space="preserve">改动</w:t>
+            </w:r>
+          </w:p>
+        </w:tc>
+        <w:tc>
+          <w:tcPr>
+            <w:shd w:fill="D9E2F3" w:color="auto" w:val="solid"/>
+          </w:tcPr>
+          <w:p>
+            <w:pPr>
+              <w:spacing w:before="40" w:after="40"/>
+            </w:pPr>
+            <w:r>
+              <w:t xml:space="preserve">说明</w:t>
+            </w:r>
+          </w:p>
+        </w:tc>
+      </w:tr>
+      <w:tr>
+        <w:tc>
+          <w:p>
+            <w:pPr>
+              <w:spacing w:before="40" w:after="40"/>
+            </w:pPr>
+            <w:r>
+              <w:rPr>
+                <w:rFonts w:ascii="Consolas" w:cs="Consolas" w:eastAsia="Consolas" w:hAnsi="Consolas"/>
+                <w:shd w:fill="ECECEC" w:color="auto" w:val="solid"/>
+              </w:rPr>
+              <w:t xml:space="preserve">components/renderer/RendererNode.vue</w:t>
+            </w:r>
+          </w:p>
+        </w:tc>
+        <w:tc>
+          <w:p>
+            <w:pPr>
+              <w:spacing w:before="40" w:after="40"/>
+            </w:pPr>
+            <w:r>
+              <w:t xml:space="preserve">后端返回冻结状态时，前端将字段设为只读 + 隐藏操作按钮</w:t>
+            </w:r>
+          </w:p>
+        </w:tc>
+        <w:tc>
+          <w:p>
+            <w:pPr>
+              <w:spacing w:before="40" w:after="40"/>
+            </w:pPr>
+            <w:r>
+              <w:t xml:space="preserve">扩展现有权限过滤逻辑</w:t>
+            </w:r>
+          </w:p>
+        </w:tc>
+      </w:tr>
+      <w:tr>
+        <w:tc>
+          <w:p>
+            <w:pPr>
+              <w:spacing w:before="40" w:after="40"/>
+            </w:pPr>
+            <w:r>
+              <w:rPr>
+                <w:rFonts w:ascii="Consolas" w:cs="Consolas" w:eastAsia="Consolas" w:hAnsi="Consolas"/>
+                <w:shd w:fill="ECECEC" w:color="auto" w:val="solid"/>
+              </w:rPr>
+              <w:t xml:space="preserve">utils/permission.ts</w:t>
+            </w:r>
+          </w:p>
+        </w:tc>
+        <w:tc>
+          <w:p>
+            <w:pPr>
+              <w:spacing w:before="40" w:after="40"/>
+            </w:pPr>
+            <w:r>
+              <w:t xml:space="preserve">加 </w:t>
+            </w:r>
+            <w:r>
+              <w:rPr>
+                <w:rFonts w:ascii="Consolas" w:cs="Consolas" w:eastAsia="Consolas" w:hAnsi="Consolas"/>
+                <w:shd w:fill="ECECEC" w:color="auto" w:val="solid"/>
+              </w:rPr>
+              <w:t xml:space="preserve">isFrozen(bizCode, currentState)</w:t>
+            </w:r>
+            <w:r>
+              <w:t xml:space="preserve"> 检查</w:t>
+            </w:r>
+          </w:p>
+        </w:tc>
+        <w:tc>
+          <w:p>
+            <w:pPr>
+              <w:spacing w:before="40" w:after="40"/>
+            </w:pPr>
+            <w:r>
+              <w:t xml:space="preserve">扩展现有权限工具</w:t>
+            </w:r>
+          </w:p>
+        </w:tc>
+      </w:tr>
+    </w:tbl>
+    <w:p>
+      <w:r/>
+    </w:p>
+    <w:p>
+      <w:r/>
+    </w:p>
+    <w:p>
+      <w:pPr>
+        <w:spacing w:before="40" w:after="40"/>
+      </w:pPr>
+      <w:r>
+        <w:t xml:space="preserve">前端无需独立配置，冻结状态由后端返回，前端只做展现控制（只读/隐藏按钮），与权限驱动渲染机制一致。</w:t>
+      </w:r>
+    </w:p>
+    <w:p>
+      <w:r/>
+    </w:p>
+    <w:p>
+      <w:pPr>
+        <w:pStyle w:val="Heading3"/>
+      </w:pPr>
+      <w:r>
+        <w:rPr>
+          <w:b/>
+          <w:bCs/>
+          <w:rFonts w:ascii="微软雅黑" w:cs="微软雅黑" w:eastAsia="微软雅黑" w:hAnsi="微软雅黑"/>
+        </w:rPr>
+        <w:t xml:space="preserve">28.4 附件管理（P2）</w:t>
+      </w:r>
+    </w:p>
+    <w:p>
+      <w:r/>
+    </w:p>
+    <w:tbl>
+      <w:tblPr>
+        <w:tblW w:type="pct" w:w="100%"/>
+        <w:tblBorders>
+          <w:top w:val="single" w:color="auto" w:sz="4"/>
+          <w:left w:val="single" w:color="auto" w:sz="4"/>
+          <w:bottom w:val="single" w:color="auto" w:sz="4"/>
+          <w:right w:val="single" w:color="auto" w:sz="4"/>
+          <w:insideH w:val="single" w:color="auto" w:sz="4"/>
+          <w:insideV w:val="single" w:color="auto" w:sz="4"/>
+        </w:tblBorders>
+      </w:tblPr>
+      <w:tblGrid>
+        <w:gridCol w:w="100"/>
+        <w:gridCol w:w="100"/>
+        <w:gridCol w:w="100"/>
+      </w:tblGrid>
+      <w:tr>
+        <w:trPr>
+          <w:tblHeader/>
+        </w:trPr>
+        <w:tc>
+          <w:tcPr>
+            <w:shd w:fill="D9E2F3" w:color="auto" w:val="solid"/>
+          </w:tcPr>
+          <w:p>
+            <w:pPr>
+              <w:spacing w:before="40" w:after="40"/>
+            </w:pPr>
+            <w:r>
+              <w:t xml:space="preserve">文件</w:t>
+            </w:r>
+          </w:p>
+        </w:tc>
+        <w:tc>
+          <w:tcPr>
+            <w:shd w:fill="D9E2F3" w:color="auto" w:val="solid"/>
+          </w:tcPr>
+          <w:p>
+            <w:pPr>
+              <w:spacing w:before="40" w:after="40"/>
+            </w:pPr>
+            <w:r>
+              <w:t xml:space="preserve">改动</w:t>
+            </w:r>
+          </w:p>
+        </w:tc>
+        <w:tc>
+          <w:tcPr>
+            <w:shd w:fill="D9E2F3" w:color="auto" w:val="solid"/>
+          </w:tcPr>
+          <w:p>
+            <w:pPr>
+              <w:spacing w:before="40" w:after="40"/>
+            </w:pPr>
+            <w:r>
+              <w:t xml:space="preserve">说明</w:t>
+            </w:r>
+          </w:p>
+        </w:tc>
+      </w:tr>
+      <w:tr>
+        <w:tc>
+          <w:p>
+            <w:pPr>
+              <w:spacing w:before="40" w:after="40"/>
+            </w:pPr>
+            <w:r>
+              <w:rPr>
+                <w:b/>
+                <w:bCs/>
+              </w:rPr>
+              <w:t xml:space="preserve">新建</w:t>
+            </w:r>
+            <w:r>
+              <w:t xml:space="preserve"> </w:t>
+            </w:r>
+            <w:r>
+              <w:rPr>
+                <w:rFonts w:ascii="Consolas" w:cs="Consolas" w:eastAsia="Consolas" w:hAnsi="Consolas"/>
+                <w:shd w:fill="ECECEC" w:color="auto" w:val="solid"/>
+              </w:rPr>
+              <w:t xml:space="preserve">components/renderer/AttachmentPanel.vue</w:t>
+            </w:r>
+          </w:p>
+        </w:tc>
+        <w:tc>
+          <w:p>
+            <w:pPr>
+              <w:spacing w:before="40" w:after="40"/>
+            </w:pPr>
+            <w:r>
+              <w:t xml:space="preserve">附件上传/下载/删除区域</w:t>
+            </w:r>
+          </w:p>
+        </w:tc>
+        <w:tc>
+          <w:p>
+            <w:pPr>
+              <w:spacing w:before="40" w:after="40"/>
+            </w:pPr>
+            <w:r>
+              <w:t xml:space="preserve">运行时组件</w:t>
+            </w:r>
+          </w:p>
+        </w:tc>
+      </w:tr>
+      <w:tr>
+        <w:tc>
+          <w:p>
+            <w:pPr>
+              <w:spacing w:before="40" w:after="40"/>
+            </w:pPr>
+            <w:r>
+              <w:rPr>
+                <w:b/>
+                <w:bCs/>
+              </w:rPr>
+              <w:t xml:space="preserve">新建</w:t>
+            </w:r>
+            <w:r>
+              <w:t xml:space="preserve"> </w:t>
+            </w:r>
+            <w:r>
+              <w:rPr>
+                <w:rFonts w:ascii="Consolas" w:cs="Consolas" w:eastAsia="Consolas" w:hAnsi="Consolas"/>
+                <w:shd w:fill="ECECEC" w:color="auto" w:val="solid"/>
+              </w:rPr>
+              <w:t xml:space="preserve">components/designer/AttachmentConfigDialog.vue</w:t>
+            </w:r>
+          </w:p>
+        </w:tc>
+        <w:tc>
+          <w:p>
+            <w:pPr>
+              <w:spacing w:before="40" w:after="40"/>
+            </w:pPr>
+            <w:r>
+              <w:t xml:space="preserve">附件配置弹窗（类型/大小/数量/必填）</w:t>
+            </w:r>
+          </w:p>
+        </w:tc>
+        <w:tc>
+          <w:p>
+            <w:pPr>
+              <w:spacing w:before="40" w:after="40"/>
+            </w:pPr>
+            <w:r>
+              <w:t xml:space="preserve">复用现有弹窗</w:t>
+            </w:r>
+          </w:p>
+        </w:tc>
+      </w:tr>
+      <w:tr>
+        <w:tc>
+          <w:p>
+            <w:pPr>
+              <w:spacing w:before="40" w:after="40"/>
+            </w:pPr>
+            <w:r>
+              <w:rPr>
+                <w:rFonts w:ascii="Consolas" w:cs="Consolas" w:eastAsia="Consolas" w:hAnsi="Consolas"/>
+                <w:shd w:fill="ECECEC" w:color="auto" w:val="solid"/>
+              </w:rPr>
+              <w:t xml:space="preserve">types/schema.ts</w:t>
+            </w:r>
+          </w:p>
+        </w:tc>
+        <w:tc>
+          <w:p>
+            <w:pPr>
+              <w:spacing w:before="40" w:after="40"/>
+            </w:pPr>
+            <w:r>
+              <w:t xml:space="preserve">PageSchema 加 </w:t>
+            </w:r>
+            <w:r>
+              <w:rPr>
+                <w:rFonts w:ascii="Consolas" w:cs="Consolas" w:eastAsia="Consolas" w:hAnsi="Consolas"/>
+                <w:shd w:fill="ECECEC" w:color="auto" w:val="solid"/>
+              </w:rPr>
+              <w:t xml:space="preserve">attachmentConfig?</w:t>
+            </w:r>
+          </w:p>
+        </w:tc>
+        <w:tc>
+          <w:p>
+            <w:pPr>
+              <w:spacing w:before="40" w:after="40"/>
+            </w:pPr>
+            <w:r>
+              <w:t xml:space="preserve">扩展现有类型</w:t>
+            </w:r>
+          </w:p>
+        </w:tc>
+      </w:tr>
+    </w:tbl>
+    <w:p>
+      <w:r/>
+    </w:p>
+    <w:p>
+      <w:r/>
+    </w:p>
+    <w:p>
+      <w:pPr>
+        <w:pStyle w:val="Heading3"/>
+      </w:pPr>
+      <w:r>
+        <w:rPr>
+          <w:b/>
+          <w:bCs/>
+          <w:rFonts w:ascii="微软雅黑" w:cs="微软雅黑" w:eastAsia="微软雅黑" w:hAnsi="微软雅黑"/>
+        </w:rPr>
+        <w:t xml:space="preserve">28.5 数据字典（P2）</w:t>
+      </w:r>
+    </w:p>
+    <w:p>
+      <w:r/>
+    </w:p>
+    <w:tbl>
+      <w:tblPr>
+        <w:tblW w:type="pct" w:w="100%"/>
+        <w:tblBorders>
+          <w:top w:val="single" w:color="auto" w:sz="4"/>
+          <w:left w:val="single" w:color="auto" w:sz="4"/>
+          <w:bottom w:val="single" w:color="auto" w:sz="4"/>
+          <w:right w:val="single" w:color="auto" w:sz="4"/>
+          <w:insideH w:val="single" w:color="auto" w:sz="4"/>
+          <w:insideV w:val="single" w:color="auto" w:sz="4"/>
+        </w:tblBorders>
+      </w:tblPr>
+      <w:tblGrid>
+        <w:gridCol w:w="100"/>
+        <w:gridCol w:w="100"/>
+        <w:gridCol w:w="100"/>
+      </w:tblGrid>
+      <w:tr>
+        <w:trPr>
+          <w:tblHeader/>
+        </w:trPr>
+        <w:tc>
+          <w:tcPr>
+            <w:shd w:fill="D9E2F3" w:color="auto" w:val="solid"/>
+          </w:tcPr>
+          <w:p>
+            <w:pPr>
+              <w:spacing w:before="40" w:after="40"/>
+            </w:pPr>
+            <w:r>
+              <w:t xml:space="preserve">文件</w:t>
+            </w:r>
+          </w:p>
+        </w:tc>
+        <w:tc>
+          <w:tcPr>
+            <w:shd w:fill="D9E2F3" w:color="auto" w:val="solid"/>
+          </w:tcPr>
+          <w:p>
+            <w:pPr>
+              <w:spacing w:before="40" w:after="40"/>
+            </w:pPr>
+            <w:r>
+              <w:t xml:space="preserve">改动</w:t>
+            </w:r>
+          </w:p>
+        </w:tc>
+        <w:tc>
+          <w:tcPr>
+            <w:shd w:fill="D9E2F3" w:color="auto" w:val="solid"/>
+          </w:tcPr>
+          <w:p>
+            <w:pPr>
+              <w:spacing w:before="40" w:after="40"/>
+            </w:pPr>
+            <w:r>
+              <w:t xml:space="preserve">说明</w:t>
+            </w:r>
+          </w:p>
+        </w:tc>
+      </w:tr>
+      <w:tr>
+        <w:tc>
+          <w:p>
+            <w:pPr>
+              <w:spacing w:before="40" w:after="40"/>
+            </w:pPr>
+            <w:r>
+              <w:rPr>
+                <w:b/>
+                <w:bCs/>
+              </w:rPr>
+              <w:t xml:space="preserve">新建</w:t>
+            </w:r>
+            <w:r>
+              <w:t xml:space="preserve"> </w:t>
+            </w:r>
+            <w:r>
+              <w:rPr>
+                <w:rFonts w:ascii="Consolas" w:cs="Consolas" w:eastAsia="Consolas" w:hAnsi="Consolas"/>
+                <w:shd w:fill="ECECEC" w:color="auto" w:val="solid"/>
+              </w:rPr>
+              <w:t xml:space="preserve">views/DataDictView.vue</w:t>
+            </w:r>
+          </w:p>
+        </w:tc>
+        <w:tc>
+          <w:p>
+            <w:pPr>
+              <w:spacing w:before="40" w:after="40"/>
+            </w:pPr>
+            <w:r>
+              <w:t xml:space="preserve">数据字典管理（字典+字典项 CRUD）</w:t>
+            </w:r>
+          </w:p>
+        </w:tc>
+        <w:tc>
+          <w:p>
+            <w:pPr>
+              <w:spacing w:before="40" w:after="40"/>
+            </w:pPr>
+            <w:r>
+              <w:t xml:space="preserve">复用 PageManageView 模式</w:t>
+            </w:r>
+          </w:p>
+        </w:tc>
+      </w:tr>
+      <w:tr>
+        <w:tc>
+          <w:p>
+            <w:pPr>
+              <w:spacing w:before="40" w:after="40"/>
+            </w:pPr>
+            <w:r>
+              <w:rPr>
+                <w:b/>
+                <w:bCs/>
+              </w:rPr>
+              <w:t xml:space="preserve">新建</w:t>
+            </w:r>
+            <w:r>
+              <w:t xml:space="preserve"> </w:t>
+            </w:r>
+            <w:r>
+              <w:rPr>
+                <w:rFonts w:ascii="Consolas" w:cs="Consolas" w:eastAsia="Consolas" w:hAnsi="Consolas"/>
+                <w:shd w:fill="ECECEC" w:color="auto" w:val="solid"/>
+              </w:rPr>
+              <w:t xml:space="preserve">types/dict.ts</w:t>
+            </w:r>
+          </w:p>
+        </w:tc>
+        <w:tc>
+          <w:p>
+            <w:pPr>
+              <w:spacing w:before="40" w:after="40"/>
+            </w:pPr>
+            <w:r>
+              <w:t xml:space="preserve">字典类型定义</w:t>
+            </w:r>
+          </w:p>
+        </w:tc>
+        <w:tc>
+          <w:p>
+            <w:pPr>
+              <w:spacing w:before="40" w:after="40"/>
+            </w:pPr>
+            <w:r>
+              <w:t xml:space="preserve">新类型文件</w:t>
+            </w:r>
+          </w:p>
+        </w:tc>
+      </w:tr>
+      <w:tr>
+        <w:tc>
+          <w:p>
+            <w:pPr>
+              <w:spacing w:before="40" w:after="40"/>
+            </w:pPr>
+            <w:r>
+              <w:rPr>
+                <w:rFonts w:ascii="Consolas" w:cs="Consolas" w:eastAsia="Consolas" w:hAnsi="Consolas"/>
+                <w:shd w:fill="ECECEC" w:color="auto" w:val="solid"/>
+              </w:rPr>
+              <w:t xml:space="preserve">components/designer/PropertyPanel.vue</w:t>
+            </w:r>
+          </w:p>
+        </w:tc>
+        <w:tc>
+          <w:p>
+            <w:pPr>
+              <w:spacing w:before="40" w:after="40"/>
+            </w:pPr>
+            <w:r>
+              <w:t xml:space="preserve">basic 标签页字段配置加"引用字典"选择</w:t>
+            </w:r>
+          </w:p>
+        </w:tc>
+        <w:tc>
+          <w:p>
+            <w:pPr>
+              <w:spacing w:before="40" w:after="40"/>
+            </w:pPr>
+            <w:r>
+              <w:t xml:space="preserve">扩展现有属性编辑</w:t>
+            </w:r>
+          </w:p>
+        </w:tc>
+      </w:tr>
+      <w:tr>
+        <w:tc>
+          <w:p>
+            <w:pPr>
+              <w:spacing w:before="40" w:after="40"/>
+            </w:pPr>
+            <w:r>
+              <w:rPr>
+                <w:rFonts w:ascii="Consolas" w:cs="Consolas" w:eastAsia="Consolas" w:hAnsi="Consolas"/>
+                <w:shd w:fill="ECECEC" w:color="auto" w:val="solid"/>
+              </w:rPr>
+              <w:t xml:space="preserve">router/index.ts</w:t>
+            </w:r>
+          </w:p>
+        </w:tc>
+        <w:tc>
+          <w:p>
+            <w:pPr>
+              <w:spacing w:before="40" w:after="40"/>
+            </w:pPr>
+            <w:r>
+              <w:t xml:space="preserve">加 </w:t>
+            </w:r>
+            <w:r>
+              <w:rPr>
+                <w:rFonts w:ascii="Consolas" w:cs="Consolas" w:eastAsia="Consolas" w:hAnsi="Consolas"/>
+                <w:shd w:fill="ECECEC" w:color="auto" w:val="solid"/>
+              </w:rPr>
+              <w:t xml:space="preserve">/data-dict</w:t>
+            </w:r>
+            <w:r>
+              <w:t xml:space="preserve"> 路由</w:t>
+            </w:r>
+          </w:p>
+        </w:tc>
+        <w:tc>
+          <w:p>
+            <w:pPr>
+              <w:spacing w:before="40" w:after="40"/>
+            </w:pPr>
+            <w:r>
+              <w:t xml:space="preserve">扩展现有路由</w:t>
+            </w:r>
+          </w:p>
+        </w:tc>
+      </w:tr>
+    </w:tbl>
+    <w:p>
+      <w:r/>
+    </w:p>
+    <w:p>
+      <w:r/>
+    </w:p>
+    <w:p>
+      <w:pPr>
+        <w:pStyle w:val="Heading3"/>
+      </w:pPr>
+      <w:r>
+        <w:rPr>
+          <w:b/>
+          <w:bCs/>
+          <w:rFonts w:ascii="微软雅黑" w:cs="微软雅黑" w:eastAsia="微软雅黑" w:hAnsi="微软雅黑"/>
+        </w:rPr>
+        <w:t xml:space="preserve">28.6 编号规则可视化配置（P2）</w:t>
+      </w:r>
+    </w:p>
+    <w:p>
+      <w:r/>
+    </w:p>
+    <w:tbl>
+      <w:tblPr>
+        <w:tblW w:type="pct" w:w="100%"/>
+        <w:tblBorders>
+          <w:top w:val="single" w:color="auto" w:sz="4"/>
+          <w:left w:val="single" w:color="auto" w:sz="4"/>
+          <w:bottom w:val="single" w:color="auto" w:sz="4"/>
+          <w:right w:val="single" w:color="auto" w:sz="4"/>
+          <w:insideH w:val="single" w:color="auto" w:sz="4"/>
+          <w:insideV w:val="single" w:color="auto" w:sz="4"/>
+        </w:tblBorders>
+      </w:tblPr>
+      <w:tblGrid>
+        <w:gridCol w:w="100"/>
+        <w:gridCol w:w="100"/>
+        <w:gridCol w:w="100"/>
+      </w:tblGrid>
+      <w:tr>
+        <w:trPr>
+          <w:tblHeader/>
+        </w:trPr>
+        <w:tc>
+          <w:tcPr>
+            <w:shd w:fill="D9E2F3" w:color="auto" w:val="solid"/>
+          </w:tcPr>
+          <w:p>
+            <w:pPr>
+              <w:spacing w:before="40" w:after="40"/>
+            </w:pPr>
+            <w:r>
+              <w:t xml:space="preserve">文件</w:t>
+            </w:r>
+          </w:p>
+        </w:tc>
+        <w:tc>
+          <w:tcPr>
+            <w:shd w:fill="D9E2F3" w:color="auto" w:val="solid"/>
+          </w:tcPr>
+          <w:p>
+            <w:pPr>
+              <w:spacing w:before="40" w:after="40"/>
+            </w:pPr>
+            <w:r>
+              <w:t xml:space="preserve">改动</w:t>
+            </w:r>
+          </w:p>
+        </w:tc>
+        <w:tc>
+          <w:tcPr>
+            <w:shd w:fill="D9E2F3" w:color="auto" w:val="solid"/>
+          </w:tcPr>
+          <w:p>
+            <w:pPr>
+              <w:spacing w:before="40" w:after="40"/>
+            </w:pPr>
+            <w:r>
+              <w:t xml:space="preserve">说明</w:t>
+            </w:r>
+          </w:p>
+        </w:tc>
+      </w:tr>
+      <w:tr>
+        <w:tc>
+          <w:p>
+            <w:pPr>
+              <w:spacing w:before="40" w:after="40"/>
+            </w:pPr>
+            <w:r>
+              <w:rPr>
+                <w:b/>
+                <w:bCs/>
+              </w:rPr>
+              <w:t xml:space="preserve">新建</w:t>
+            </w:r>
+            <w:r>
+              <w:t xml:space="preserve"> </w:t>
+            </w:r>
+            <w:r>
+              <w:rPr>
+                <w:rFonts w:ascii="Consolas" w:cs="Consolas" w:eastAsia="Consolas" w:hAnsi="Consolas"/>
+                <w:shd w:fill="ECECEC" w:color="auto" w:val="solid"/>
+              </w:rPr>
+              <w:t xml:space="preserve">components/designer/NumberRuleDialog.vue</w:t>
+            </w:r>
+          </w:p>
+        </w:tc>
+        <w:tc>
+          <w:p>
+            <w:pPr>
+              <w:spacing w:before="40" w:after="40"/>
+            </w:pPr>
+            <w:r>
+              <w:t xml:space="preserve">编号规则可视化配置弹窗（前缀+日期格式+流水号位数+重置周期）</w:t>
+            </w:r>
+          </w:p>
+        </w:tc>
+        <w:tc>
+          <w:p>
+            <w:pPr>
+              <w:spacing w:before="40" w:after="40"/>
+            </w:pPr>
+            <w:r>
+              <w:t xml:space="preserve">复用现有弹窗</w:t>
+            </w:r>
+          </w:p>
+        </w:tc>
+      </w:tr>
+      <w:tr>
+        <w:tc>
+          <w:p>
+            <w:pPr>
+              <w:spacing w:before="40" w:after="40"/>
+            </w:pPr>
+            <w:r>
+              <w:rPr>
+                <w:rFonts w:ascii="Consolas" w:cs="Consolas" w:eastAsia="Consolas" w:hAnsi="Consolas"/>
+                <w:shd w:fill="ECECEC" w:color="auto" w:val="solid"/>
+              </w:rPr>
+              <w:t xml:space="preserve">components/designer/PropertyPanel.vue</w:t>
+            </w:r>
+          </w:p>
+        </w:tc>
+        <w:tc>
+          <w:p>
+            <w:pPr>
+              <w:spacing w:before="40" w:after="40"/>
+            </w:pPr>
+            <w:r>
+              <w:t xml:space="preserve">basic 标签页加"编号规则"配置入口</w:t>
+            </w:r>
+          </w:p>
+        </w:tc>
+        <w:tc>
+          <w:p>
+            <w:pPr>
+              <w:spacing w:before="40" w:after="40"/>
+            </w:pPr>
+            <w:r>
+              <w:t xml:space="preserve">扩展现有属性编辑</w:t>
+            </w:r>
+          </w:p>
+        </w:tc>
+      </w:tr>
+    </w:tbl>
+    <w:p>
+      <w:r/>
+    </w:p>
+    <w:p>
+      <w:r/>
+    </w:p>
+    <w:p>
+      <w:pPr>
+        <w:shd w:fill="F5F5F5" w:color="auto" w:val="solid"/>
+        <w:spacing w:before="0" w:after="0"/>
+        <w:ind w:left="200"/>
+      </w:pPr>
+      <w:r>
+        <w:rPr>
+          <w:sz w:val="18"/>
+          <w:szCs w:val="18"/>
+          <w:rFonts w:ascii="Consolas" w:cs="Consolas" w:eastAsia="Consolas" w:hAnsi="Consolas"/>
+        </w:rPr>
+        <w:t xml:space="preserve">&lt;!-- NumberRuleDialog.vue --&gt;</w:t>
+      </w:r>
+    </w:p>
+    <w:p>
+      <w:pPr>
+        <w:shd w:fill="F5F5F5" w:color="auto" w:val="solid"/>
+        <w:spacing w:before="0" w:after="0"/>
+        <w:ind w:left="200"/>
+      </w:pPr>
+      <w:r>
+        <w:rPr>
+          <w:sz w:val="18"/>
+          <w:szCs w:val="18"/>
+          <w:rFonts w:ascii="Consolas" w:cs="Consolas" w:eastAsia="Consolas" w:hAnsi="Consolas"/>
+        </w:rPr>
+        <w:t xml:space="preserve">&lt;script setup lang="ts"&gt;</w:t>
+      </w:r>
+    </w:p>
+    <w:p>
+      <w:pPr>
+        <w:shd w:fill="F5F5F5" w:color="auto" w:val="solid"/>
+        <w:spacing w:before="0" w:after="0"/>
+        <w:ind w:left="200"/>
+      </w:pPr>
+      <w:r>
+        <w:rPr>
+          <w:sz w:val="18"/>
+          <w:szCs w:val="18"/>
+          <w:rFonts w:ascii="Consolas" w:cs="Consolas" w:eastAsia="Consolas" w:hAnsi="Consolas"/>
+        </w:rPr>
+        <w:t xml:space="preserve">import { ref } from 'vue'</w:t>
+      </w:r>
+    </w:p>
+    <w:p>
+      <w:pPr>
+        <w:shd w:fill="F5F5F5" w:color="auto" w:val="solid"/>
+        <w:spacing w:before="0" w:after="0"/>
+        <w:ind w:left="200"/>
+      </w:pPr>
+      <w:r>
+        <w:rPr>
+          <w:sz w:val="18"/>
+          <w:szCs w:val="18"/>
+          <w:rFonts w:ascii="Consolas" w:cs="Consolas" w:eastAsia="Consolas" w:hAnsi="Consolas"/>
+        </w:rPr>
+        <w:t xml:space="preserve">const prefix = ref('PO')</w:t>
+      </w:r>
+    </w:p>
+    <w:p>
+      <w:pPr>
+        <w:shd w:fill="F5F5F5" w:color="auto" w:val="solid"/>
+        <w:spacing w:before="0" w:after="0"/>
+        <w:ind w:left="200"/>
+      </w:pPr>
+      <w:r>
+        <w:rPr>
+          <w:sz w:val="18"/>
+          <w:szCs w:val="18"/>
+          <w:rFonts w:ascii="Consolas" w:cs="Consolas" w:eastAsia="Consolas" w:hAnsi="Consolas"/>
+        </w:rPr>
+        <w:t xml:space="preserve">const dateFormat = ref('yyyyMMdd')</w:t>
+      </w:r>
+    </w:p>
+    <w:p>
+      <w:pPr>
+        <w:shd w:fill="F5F5F5" w:color="auto" w:val="solid"/>
+        <w:spacing w:before="0" w:after="0"/>
+        <w:ind w:left="200"/>
+      </w:pPr>
+      <w:r>
+        <w:rPr>
+          <w:sz w:val="18"/>
+          <w:szCs w:val="18"/>
+          <w:rFonts w:ascii="Consolas" w:cs="Consolas" w:eastAsia="Consolas" w:hAnsi="Consolas"/>
+        </w:rPr>
+        <w:t xml:space="preserve">const seqLength = ref(4)</w:t>
+      </w:r>
+    </w:p>
+    <w:p>
+      <w:pPr>
+        <w:shd w:fill="F5F5F5" w:color="auto" w:val="solid"/>
+        <w:spacing w:before="0" w:after="0"/>
+        <w:ind w:left="200"/>
+      </w:pPr>
+      <w:r>
+        <w:rPr>
+          <w:sz w:val="18"/>
+          <w:szCs w:val="18"/>
+          <w:rFonts w:ascii="Consolas" w:cs="Consolas" w:eastAsia="Consolas" w:hAnsi="Consolas"/>
+        </w:rPr>
+        <w:t xml:space="preserve">const seqScope = ref('DAILY')</w:t>
+      </w:r>
+    </w:p>
+    <w:p>
+      <w:pPr>
+        <w:shd w:fill="F5F5F5" w:color="auto" w:val="solid"/>
+        <w:spacing w:before="0" w:after="0"/>
+        <w:ind w:left="200"/>
+      </w:pPr>
+      <w:r>
+        <w:rPr>
+          <w:sz w:val="18"/>
+          <w:szCs w:val="18"/>
+          <w:rFonts w:ascii="Consolas" w:cs="Consolas" w:eastAsia="Consolas" w:hAnsi="Consolas"/>
+        </w:rPr>
+        <w:t xml:space="preserve">// 生成 defaultValueExpr: "generateNo('PO','yyyyMMdd',4,'DAILY')"</w:t>
+      </w:r>
+    </w:p>
+    <w:p>
+      <w:pPr>
+        <w:shd w:fill="F5F5F5" w:color="auto" w:val="solid"/>
+        <w:spacing w:before="0" w:after="0"/>
+        <w:ind w:left="200"/>
+      </w:pPr>
+      <w:r>
+        <w:rPr>
+          <w:sz w:val="18"/>
+          <w:szCs w:val="18"/>
+          <w:rFonts w:ascii="Consolas" w:cs="Consolas" w:eastAsia="Consolas" w:hAnsi="Consolas"/>
+        </w:rPr>
+        <w:t xml:space="preserve">&lt;/script&gt;</w:t>
+      </w:r>
+    </w:p>
+    <w:p>
+      <w:r/>
+    </w:p>
+    <w:p>
+      <w:r/>
+    </w:p>
+    <w:p>
+      <w:pPr>
+        <w:pStyle w:val="Heading3"/>
+      </w:pPr>
+      <w:r>
+        <w:rPr>
+          <w:b/>
+          <w:bCs/>
+          <w:rFonts w:ascii="微软雅黑" w:cs="微软雅黑" w:eastAsia="微软雅黑" w:hAnsi="微软雅黑"/>
+        </w:rPr>
+        <w:t xml:space="preserve">28.7 新增文件汇总</w:t>
+      </w:r>
+    </w:p>
+    <w:p>
+      <w:r/>
+    </w:p>
+    <w:tbl>
+      <w:tblPr>
+        <w:tblW w:type="pct" w:w="100%"/>
+        <w:tblBorders>
+          <w:top w:val="single" w:color="auto" w:sz="4"/>
+          <w:left w:val="single" w:color="auto" w:sz="4"/>
+          <w:bottom w:val="single" w:color="auto" w:sz="4"/>
+          <w:right w:val="single" w:color="auto" w:sz="4"/>
+          <w:insideH w:val="single" w:color="auto" w:sz="4"/>
+          <w:insideV w:val="single" w:color="auto" w:sz="4"/>
+        </w:tblBorders>
+      </w:tblPr>
+      <w:tblGrid>
+        <w:gridCol w:w="100"/>
+        <w:gridCol w:w="100"/>
+        <w:gridCol w:w="100"/>
+      </w:tblGrid>
+      <w:tr>
+        <w:trPr>
+          <w:tblHeader/>
+        </w:trPr>
+        <w:tc>
+          <w:tcPr>
+            <w:shd w:fill="D9E2F3" w:color="auto" w:val="solid"/>
+          </w:tcPr>
+          <w:p>
+            <w:pPr>
+              <w:spacing w:before="40" w:after="40"/>
+            </w:pPr>
+            <w:r>
+              <w:t xml:space="preserve">新增文件</w:t>
+            </w:r>
+          </w:p>
+        </w:tc>
+        <w:tc>
+          <w:tcPr>
+            <w:shd w:fill="D9E2F3" w:color="auto" w:val="solid"/>
+          </w:tcPr>
+          <w:p>
+            <w:pPr>
+              <w:spacing w:before="40" w:after="40"/>
+            </w:pPr>
+            <w:r>
+              <w:t xml:space="preserve">作用</w:t>
+            </w:r>
+          </w:p>
+        </w:tc>
+        <w:tc>
+          <w:tcPr>
+            <w:shd w:fill="D9E2F3" w:color="auto" w:val="solid"/>
+          </w:tcPr>
+          <w:p>
+            <w:pPr>
+              <w:spacing w:before="40" w:after="40"/>
+            </w:pPr>
+            <w:r>
+              <w:t xml:space="preserve">来源</w:t>
+            </w:r>
+          </w:p>
+        </w:tc>
+      </w:tr>
+      <w:tr>
+        <w:tc>
+          <w:p>
+            <w:pPr>
+              <w:spacing w:before="40" w:after="40"/>
+            </w:pPr>
+            <w:r>
+              <w:rPr>
+                <w:rFonts w:ascii="Consolas" w:cs="Consolas" w:eastAsia="Consolas" w:hAnsi="Consolas"/>
+                <w:shd w:fill="ECECEC" w:color="auto" w:val="solid"/>
+              </w:rPr>
+              <w:t xml:space="preserve">components/renderer/BatchActionDialog.vue</w:t>
+            </w:r>
+          </w:p>
+        </w:tc>
+        <w:tc>
+          <w:p>
+            <w:pPr>
+              <w:spacing w:before="40" w:after="40"/>
+            </w:pPr>
+            <w:r>
+              <w:t xml:space="preserve">批量操作确认</w:t>
+            </w:r>
+          </w:p>
+        </w:tc>
+        <w:tc>
+          <w:p>
+            <w:pPr>
+              <w:spacing w:before="40" w:after="40"/>
+            </w:pPr>
+            <w:r>
+              <w:t xml:space="preserve">批量操作</w:t>
+            </w:r>
+          </w:p>
+        </w:tc>
+      </w:tr>
+      <w:tr>
+        <w:tc>
+          <w:p>
+            <w:pPr>
+              <w:spacing w:before="40" w:after="40"/>
+            </w:pPr>
+            <w:r>
+              <w:rPr>
+                <w:rFonts w:ascii="Consolas" w:cs="Consolas" w:eastAsia="Consolas" w:hAnsi="Consolas"/>
+                <w:shd w:fill="ECECEC" w:color="auto" w:val="solid"/>
+              </w:rPr>
+              <w:t xml:space="preserve">components/renderer/AttachmentPanel.vue</w:t>
+            </w:r>
+          </w:p>
+        </w:tc>
+        <w:tc>
+          <w:p>
+            <w:pPr>
+              <w:spacing w:before="40" w:after="40"/>
+            </w:pPr>
+            <w:r>
+              <w:t xml:space="preserve">附件上传区域</w:t>
+            </w:r>
+          </w:p>
+        </w:tc>
+        <w:tc>
+          <w:p>
+            <w:pPr>
+              <w:spacing w:before="40" w:after="40"/>
+            </w:pPr>
+            <w:r>
+              <w:t xml:space="preserve">附件管理</w:t>
+            </w:r>
+          </w:p>
+        </w:tc>
+      </w:tr>
+      <w:tr>
+        <w:tc>
+          <w:p>
+            <w:pPr>
+              <w:spacing w:before="40" w:after="40"/>
+            </w:pPr>
+            <w:r>
+              <w:rPr>
+                <w:rFonts w:ascii="Consolas" w:cs="Consolas" w:eastAsia="Consolas" w:hAnsi="Consolas"/>
+                <w:shd w:fill="ECECEC" w:color="auto" w:val="solid"/>
+              </w:rPr>
+              <w:t xml:space="preserve">components/designer/AttachmentConfigDialog.vue</w:t>
+            </w:r>
+          </w:p>
+        </w:tc>
+        <w:tc>
+          <w:p>
+            <w:pPr>
+              <w:spacing w:before="40" w:after="40"/>
+            </w:pPr>
+            <w:r>
+              <w:t xml:space="preserve">附件配置</w:t>
+            </w:r>
+          </w:p>
+        </w:tc>
+        <w:tc>
+          <w:p>
+            <w:pPr>
+              <w:spacing w:before="40" w:after="40"/>
+            </w:pPr>
+            <w:r>
+              <w:t xml:space="preserve">附件管理</w:t>
+            </w:r>
+          </w:p>
+        </w:tc>
+      </w:tr>
+      <w:tr>
+        <w:tc>
+          <w:p>
+            <w:pPr>
+              <w:spacing w:before="40" w:after="40"/>
+            </w:pPr>
+            <w:r>
+              <w:rPr>
+                <w:rFonts w:ascii="Consolas" w:cs="Consolas" w:eastAsia="Consolas" w:hAnsi="Consolas"/>
+                <w:shd w:fill="ECECEC" w:color="auto" w:val="solid"/>
+              </w:rPr>
+              <w:t xml:space="preserve">views/DataDictView.vue</w:t>
+            </w:r>
+          </w:p>
+        </w:tc>
+        <w:tc>
+          <w:p>
+            <w:pPr>
+              <w:spacing w:before="40" w:after="40"/>
+            </w:pPr>
+            <w:r>
+              <w:t xml:space="preserve">数据字典管理</w:t>
+            </w:r>
+          </w:p>
+        </w:tc>
+        <w:tc>
+          <w:p>
+            <w:pPr>
+              <w:spacing w:before="40" w:after="40"/>
+            </w:pPr>
+            <w:r>
+              <w:t xml:space="preserve">数据字典</w:t>
+            </w:r>
+          </w:p>
+        </w:tc>
+      </w:tr>
+      <w:tr>
+        <w:tc>
+          <w:p>
+            <w:pPr>
+              <w:spacing w:before="40" w:after="40"/>
+            </w:pPr>
+            <w:r>
+              <w:rPr>
+                <w:rFonts w:ascii="Consolas" w:cs="Consolas" w:eastAsia="Consolas" w:hAnsi="Consolas"/>
+                <w:shd w:fill="ECECEC" w:color="auto" w:val="solid"/>
+              </w:rPr>
+              <w:t xml:space="preserve">types/dict.ts</w:t>
+            </w:r>
+          </w:p>
+        </w:tc>
+        <w:tc>
+          <w:p>
+            <w:pPr>
+              <w:spacing w:before="40" w:after="40"/>
+            </w:pPr>
+            <w:r>
+              <w:t xml:space="preserve">字典类型</w:t>
+            </w:r>
+          </w:p>
+        </w:tc>
+        <w:tc>
+          <w:p>
+            <w:pPr>
+              <w:spacing w:before="40" w:after="40"/>
+            </w:pPr>
+            <w:r>
+              <w:t xml:space="preserve">数据字典</w:t>
+            </w:r>
+          </w:p>
+        </w:tc>
+      </w:tr>
+      <w:tr>
+        <w:tc>
+          <w:p>
+            <w:pPr>
+              <w:spacing w:before="40" w:after="40"/>
+            </w:pPr>
+            <w:r>
+              <w:rPr>
+                <w:rFonts w:ascii="Consolas" w:cs="Consolas" w:eastAsia="Consolas" w:hAnsi="Consolas"/>
+                <w:shd w:fill="ECECEC" w:color="auto" w:val="solid"/>
+              </w:rPr>
+              <w:t xml:space="preserve">components/designer/NumberRuleDialog.vue</w:t>
+            </w:r>
+          </w:p>
+        </w:tc>
+        <w:tc>
+          <w:p>
+            <w:pPr>
+              <w:spacing w:before="40" w:after="40"/>
+            </w:pPr>
+            <w:r>
+              <w:t xml:space="preserve">编号规则配置</w:t>
+            </w:r>
+          </w:p>
+        </w:tc>
+        <w:tc>
+          <w:p>
+            <w:pPr>
+              <w:spacing w:before="40" w:after="40"/>
+            </w:pPr>
+            <w:r>
+              <w:t xml:space="preserve">编号规则</w:t>
+            </w:r>
+          </w:p>
+        </w:tc>
+      </w:tr>
+    </w:tbl>
+    <w:p>
+      <w:r/>
+    </w:p>
+    <w:p>
+      <w:r/>
+    </w:p>
+    <w:p>
+      <w:pPr>
+        <w:pBdr>
+          <w:bottom w:val="single" w:color="BFBFBF" w:sz="6" w:space="1"/>
+        </w:pBdr>
+      </w:pPr>
+      <w:r/>
+    </w:p>
+    <w:p>
+      <w:r/>
+    </w:p>
+    <w:p>
+      <w:pPr>
+        <w:pStyle w:val="Heading2"/>
+      </w:pPr>
+      <w:r>
+        <w:rPr>
+          <w:b/>
+          <w:bCs/>
+          <w:rFonts w:ascii="微软雅黑" w:cs="微软雅黑" w:eastAsia="微软雅黑" w:hAnsi="微软雅黑"/>
+        </w:rPr>
+        <w:t xml:space="preserve">29. 落地顺序（前端）</w:t>
       </w:r>
     </w:p>
     <w:p>
@@ -21549,6 +23665,48 @@
           </w:p>
         </w:tc>
       </w:tr>
+      <w:tr>
+        <w:tc>
+          <w:p>
+            <w:pPr>
+              <w:spacing w:before="40" w:after="40"/>
+            </w:pPr>
+            <w:r>
+              <w:t xml:space="preserve">FE-S10（用友借鉴功能增强）</w:t>
+            </w:r>
+          </w:p>
+        </w:tc>
+        <w:tc>
+          <w:p>
+            <w:pPr>
+              <w:spacing w:before="40" w:after="40"/>
+            </w:pPr>
+            <w:r>
+              <w:t xml:space="preserve">RendererNode 计算表达式 watch + BatchActionDialog + 冻结状态只读 + AttachmentPanel + AttachmentConfigDialog + DataDictView + dict.ts + NumberRuleDialog + PropertyPanel 配置入口</w:t>
+            </w:r>
+          </w:p>
+        </w:tc>
+        <w:tc>
+          <w:p>
+            <w:pPr>
+              <w:spacing w:before="40" w:after="40"/>
+            </w:pPr>
+            <w:r>
+              <w:t xml:space="preserve">后端第 29 章（计算表达式/批量操作/数据冻结/附件/字典/编号规则）</w:t>
+            </w:r>
+          </w:p>
+        </w:tc>
+        <w:tc>
+          <w:p>
+            <w:pPr>
+              <w:spacing w:before="40" w:after="40"/>
+            </w:pPr>
+            <w:r>
+              <w:t xml:space="preserve">第 28 章</w:t>
+            </w:r>
+          </w:p>
+        </w:tc>
+      </w:tr>
     </w:tbl>
     <w:p>
       <w:r/>
@@ -21568,7 +23726,7 @@
         <w:t xml:space="preserve">优先级</w:t>
       </w:r>
       <w:r>
-        <w:t xml:space="preserve">：FE-S0 + FE-S1 + FE-S2 + FE-S3 + FE-S9 优先（对应后端 G1-G3 + P1 + S1 + S2 + API 治理）。</w:t>
+        <w:t xml:space="preserve">：FE-S0 + FE-S1 + FE-S2 + FE-S3 + FE-S9 优先（对应后端 G1-G3 + P1 + S1 + S2 + API 治理）；FE-S10 随后端第 29 章各功能优先级（P1 先行：计算表达式+批量操作+数据冻结，P2 跟进：附件+字典+编号规则）。</w:t>
       </w:r>
     </w:p>
     <w:p>
@@ -21595,7 +23753,7 @@
           <w:bCs/>
           <w:rFonts w:ascii="微软雅黑" w:cs="微软雅黑" w:eastAsia="微软雅黑" w:hAnsi="微软雅黑"/>
         </w:rPr>
-        <w:t xml:space="preserve">29. 关键约束（遵循现有规范）</w:t>
+        <w:t xml:space="preserve">30. 关键约束（遵循现有规范）</w:t>
       </w:r>
     </w:p>
     <w:p>
@@ -21803,6 +23961,25 @@
       </w:r>
     </w:p>
     <w:p>
+      <w:pPr>
+        <w:pStyle w:val="ListParagraph"/>
+        <w:numPr>
+          <w:ilvl w:val="0"/>
+          <w:numId w:val="1"/>
+        </w:numPr>
+      </w:pPr>
+      <w:r>
+        <w:rPr>
+          <w:b/>
+          <w:bCs/>
+        </w:rPr>
+        <w:t xml:space="preserve">RendererNode 拆分</w:t>
+      </w:r>
+      <w:r>
+        <w:t xml:space="preserve">：FE-S0 阶段将 RendererNode.vue 拆为 RendererForm/RendererTable/RendererDetail 三个子组件，避免单文件膨胀（后端第 31.4 节前端评审建议）</w:t>
+      </w:r>
+    </w:p>
+    <w:p>
       <w:r/>
     </w:p>
     <w:p>
@@ -21825,7 +24002,7 @@
           <w:b/>
           <w:bCs/>
         </w:rPr>
-        <w:t xml:space="preserve">文档结束。核心：所有前端改动基于现有代码扩展（扩 21 文件 + 新增 36 文件，复用现有模式），不另起炉灶，不重写设计器，不引入新框架。后端架构与接口定义详见《低代码平台后端设计文档.md》。</w:t>
+        <w:t xml:space="preserve">文档结束。核心：所有前端改动基于现有代码扩展（扩 21 文件 + 新增 42 文件，复用现有模式），不另起炉灶，不重写设计器，不引入新框架。后端架构与接口定义详见《低代码平台后端设计文档.md》，全方案最终多角色评审详见后端文档第 31 章（7 角色×4 维度，含可扩展性专项评估）。</w:t>
       </w:r>
     </w:p>
     <w:p>

</xml_diff>